<commit_message>
Adiciona ficha catalografica a todos os e-books existentes
Insere registro de catalogacao (CIP) no inicio de cada e-book ja
publicado, preparando o material para futura solicitacao de ISBN
junto a Agencia Brasileira do ISBN, tanto na versao impressa quanto
na digital.

Co-Authored-By: Claude Sonnet 5 <noreply@anthropic.com>
</commit_message>
<xml_diff>
--- a/leitura/A Startap Unicornio.docx
+++ b/leitura/A Startap Unicornio.docx
@@ -2,6 +2,96 @@
 <file path=word/document.xml><?xml version="1.0" encoding="utf-8"?>
 <w:document xmlns:wpc="http://schemas.microsoft.com/office/word/2010/wordprocessingCanvas" xmlns:mo="http://schemas.microsoft.com/office/mac/office/2008/main" xmlns:mc="http://schemas.openxmlformats.org/markup-compatibility/2006" xmlns:mv="urn:schemas-microsoft-com:mac:vml" xmlns:o="urn:schemas-microsoft-com:office:office" xmlns:r="http://schemas.openxmlformats.org/officeDocument/2006/relationships" xmlns:m="http://schemas.openxmlformats.org/officeDocument/2006/math" xmlns:v="urn:schemas-microsoft-com:vml" xmlns:wp14="http://schemas.microsoft.com/office/word/2010/wordprocessingDrawing" xmlns:wp="http://schemas.openxmlformats.org/drawingml/2006/wordprocessingDrawing" xmlns:w10="urn:schemas-microsoft-com:office:word" xmlns:w="http://schemas.openxmlformats.org/wordprocessingml/2006/main" xmlns:w14="http://schemas.microsoft.com/office/word/2010/wordml" xmlns:wpg="http://schemas.microsoft.com/office/word/2010/wordprocessingGroup" xmlns:wpi="http://schemas.microsoft.com/office/word/2010/wordprocessingInk" xmlns:wne="http://schemas.microsoft.com/office/word/2006/wordml" xmlns:wps="http://schemas.microsoft.com/office/word/2010/wordprocessingShape" mc:Ignorable="w14 wp14">
   <w:body>
+    <w:p>
+      <w:pPr>
+        <w:spacing w:after="160"/>
+      </w:pPr>
+      <w:r>
+        <w:rPr>
+          <w:b/>
+          <w:i w:val="0"/>
+          <w:sz w:val="26"/>
+        </w:rPr>
+        <w:t>FICHA CATALOGRÁFICA</w:t>
+      </w:r>
+    </w:p>
+    <w:p>
+      <w:pPr>
+        <w:spacing w:after="160"/>
+      </w:pPr>
+      <w:r>
+        <w:rPr>
+          <w:b/>
+          <w:i w:val="0"/>
+        </w:rPr>
+        <w:t>Sena, Gilberto</w:t>
+      </w:r>
+    </w:p>
+    <w:p>
+      <w:pPr>
+        <w:spacing w:after="160"/>
+      </w:pPr>
+      <w:r>
+        <w:t>A startap unicórnio : empreendedorismo enxuto e construção de negócios a partir do zero / Gilberto Sena. -- 1. ed. digital. -- 2026.</w:t>
+      </w:r>
+    </w:p>
+    <w:p>
+      <w:pPr>
+        <w:spacing w:after="160"/>
+      </w:pPr>
+      <w:r>
+        <w:t>E-book.</w:t>
+      </w:r>
+    </w:p>
+    <w:p>
+      <w:pPr>
+        <w:spacing w:after="160"/>
+      </w:pPr>
+      <w:r>
+        <w:t>Inclui bibliografia.</w:t>
+      </w:r>
+    </w:p>
+    <w:p>
+      <w:pPr>
+        <w:spacing w:after="160"/>
+      </w:pPr>
+      <w:r>
+        <w:t>1. Empreendedorismo. 2. Startups. 3. Gestão de negócios. 4. Inovação. I. Título.</w:t>
+      </w:r>
+    </w:p>
+    <w:p>
+      <w:pPr>
+        <w:spacing w:after="160"/>
+      </w:pPr>
+      <w:r>
+        <w:t>CDD (classificação indicativa): 658.11</w:t>
+      </w:r>
+    </w:p>
+    <w:p>
+      <w:pPr>
+        <w:spacing w:after="160"/>
+      </w:pPr>
+      <w:r>
+        <w:t>Extensão aproximada: 40 páginas (versão digital).</w:t>
+      </w:r>
+    </w:p>
+    <w:p>
+      <w:pPr>
+        <w:spacing w:after="160"/>
+      </w:pPr>
+      <w:r>
+        <w:rPr>
+          <w:b w:val="0"/>
+          <w:i/>
+        </w:rPr>
+        <w:t>Ficha catalográfica elaborada pelo próprio autor, a partir dos dados fornecidos pela obra, para fins de organização e futura solicitação de registro junto à Agência Brasileira do ISBN (Fundação Biblioteca Nacional). Não constitui, até a data desta atualização, registro oficial de ISBN — o número correspondente, quando concedido, será incluído em edição posterior, tanto na versão impressa quanto na versão digital.</w:t>
+      </w:r>
+    </w:p>
+    <w:p>
+      <w:pPr>
+        <w:spacing w:after="160"/>
+      </w:pPr>
+    </w:p>
     <w:p>
       <w:pPr>
         <w:pStyle w:val="Heading1"/>

</xml_diff>